<commit_message>
Initialisation du projet + CLAUDE.md
</commit_message>
<xml_diff>
--- a/CityFlow_AI_CDCFT_Vibeathon_1.docx
+++ b/CityFlow_AI_CDCFT_Vibeathon_1.docx
@@ -176,7 +176,7 @@
                 <w:sz w:val="20"/>
                 <w:szCs w:val="20"/>
               </w:rPr>
-              <w:t xml:space="preserve">• Données de démonstration : historique simulé et 10 utilisateurs fictifs, faute de données réelles disponibles à ce stade.</w:t>
+              <w:t>• Données de démonstration : géométrie des segments et historique météo issus de sources réelles (OpenStreetMap / Humanitarian Data Exchange pour les routes, API météo historique pour la pluviométrie) ; historique de trafic et signalements restent simulés, faute d'API de congestion ouverte pour Abidjan à ce stade, mais calibrés sur des patterns réels et reproductibles (seed fixe).</w:t>
             </w:r>
           </w:p>
           <w:p>
@@ -922,6 +922,59 @@
     </w:p>
     <w:p>
       <w:pPr>
+        <w:pStyle w:val="Heading2"/>
+      </w:pPr>
+      <w:r>
+        <w:t>Critères d'acceptation MVP</w:t>
+      </w:r>
+    </w:p>
+    <w:p>
+      <w:r>
+        <w:t>Ces critères servent de base aux tests automatiques et vérifications manuelles de l'étape 5 :</w:t>
+      </w:r>
+    </w:p>
+    <w:p>
+      <w:pPr>
+        <w:pStyle w:val="ListParagraph"/>
+      </w:pPr>
+      <w:r>
+        <w:t>La prédiction de congestion (GET /api/predictions/&lt;id&gt;/) répond en moins de 500 ms sur le jeu de données de démo.</w:t>
+      </w:r>
+    </w:p>
+    <w:p>
+      <w:pPr>
+        <w:pStyle w:val="ListParagraph"/>
+      </w:pPr>
+      <w:r>
+        <w:t>Un signalement identique (même type, même segment) posté deux fois en moins de 5 minutes est fusionné, pas dupliqué.</w:t>
+      </w:r>
+    </w:p>
+    <w:p>
+      <w:pPr>
+        <w:pStyle w:val="ListParagraph"/>
+      </w:pPr>
+      <w:r>
+        <w:t>Le dashboard autorités (GET /api/dashboard/critical-zones/) est inaccessible à un utilisateur de rôle citoyen (403).</w:t>
+      </w:r>
+    </w:p>
+    <w:p>
+      <w:pPr>
+        <w:pStyle w:val="ListParagraph"/>
+      </w:pPr>
+      <w:r>
+        <w:t>Chaque prédiction affichée est accompagnée de ses facteurs explicatifs, sans exception.</w:t>
+      </w:r>
+    </w:p>
+    <w:p>
+      <w:pPr>
+        <w:pStyle w:val="ListParagraph"/>
+      </w:pPr>
+      <w:r>
+        <w:t>Le scénario de démonstration Awa (Cocody → Plateau) se déroule de bout en bout sans erreur visible.</w:t>
+      </w:r>
+    </w:p>
+    <w:p>
+      <w:pPr>
         <w:pStyle w:val="Heading1"/>
         <w:spacing w:after="200" w:before="400"/>
       </w:pPr>
@@ -1399,6 +1452,11 @@
       </w:r>
     </w:p>
     <w:p>
+      <w:r>
+        <w:t>Chaque niveau de risque (congestion, météo) est signalé par un double codage — couleur ET icône/libellé texte — pour rester lisible par les utilisateurs daltoniens. Une mention "© OpenStreetMap contributors" est affichée dans l'application, conformément à la licence ODbL des données de géométrie des segments.</w:t>
+      </w:r>
+    </w:p>
+    <w:p>
       <w:pPr>
         <w:spacing w:after="160"/>
       </w:pPr>
@@ -1425,7 +1483,7 @@
         <w:spacing w:after="160"/>
       </w:pPr>
       <w:r>
-        <w:t xml:space="preserve">Moteur de prédiction interne, exécuté côté backend Django. Un job périodique (toutes les 5 minutes) recalcule les scores de congestion et les stocke ; les endpoints de lecture restent rapides et fiables pour la démonstration. Chaque prédiction est accompagnée de ses facteurs explicatifs (transparence).</w:t>
+        <w:t>Moteur de prédiction interne, exécuté côté backend Django. Un job périodique (toutes les 5 minutes) recalcule les scores de congestion et les stocke ; les endpoints de lecture restent rapides et fiables pour la démonstration. Le moteur s'appuie sur une géométrie de segments et un historique météo réels (importés depuis OpenStreetMap/HDX et une API météo historique), combinés à un historique de congestion simulé mais calibré sur des patterns horaires réels. Chaque prédiction est accompagnée de ses facteurs explicatifs (transparence).</w:t>
       </w:r>
     </w:p>
     <w:p>
@@ -1529,7 +1587,7 @@
         <w:spacing w:after="160"/>
       </w:pPr>
       <w:r>
-        <w:t xml:space="preserve">Objectif : prédire la congestion à T+15 minutes. Entrées : historique simulé, heure, jour de semaine, météo simulée. Sortie : score de congestion 0-100 accompagné de ses facteurs.</w:t>
+        <w:t>Objectif : prédire la congestion à T+15 minutes. Entrées : historique de congestion simulé mais calibré (courbe horaire réaliste, bruit modéré, seed reproductible), heure, jour de semaine, historique météo réel importé pour la zone. Sortie : score de congestion 0-100 accompagné de ses facteurs.</w:t>
       </w:r>
     </w:p>
     <w:p>
@@ -1546,7 +1604,26 @@
         <w:spacing w:after="160"/>
       </w:pPr>
       <w:r>
-        <w:t xml:space="preserve">Objectif : détecter le risque d'inondation par segment. Entrée : intensité de pluie simulée et statut zone_inondable du segment. Sortie : alerte activée/désactivée avec niveau de risque.</w:t>
+        <w:t>Objectif : détecter le risque d'inondation par segment. Entrée : intensité de pluie issue d'un historique météo réel importé, et statut zone_inondable du segment déterminé à partir d'une géométrie réelle (OpenStreetMap/HDX) plutôt que d'un tirage aléatoire. Sortie : alerte activée/désactivée avec niveau de risque.</w:t>
+      </w:r>
+    </w:p>
+    <w:p>
+      <w:pPr>
+        <w:spacing w:after="200"/>
+      </w:pPr>
+    </w:p>
+    <w:p>
+      <w:pPr>
+        <w:pStyle w:val="Heading1"/>
+        <w:spacing w:after="200" w:before="400"/>
+      </w:pPr>
+      <w:r>
+        <w:t>6. Vision V2 — hors MVP</w:t>
+      </w:r>
+    </w:p>
+    <w:p>
+      <w:r>
+        <w:t>Cette section regroupe les quatre évolutions identifiées mais volontairement écartées du MVP par manque de temps sur une semaine, plutôt que par manque d'ambition. Chacune est présentée avec ce qu'elle apporterait et ce qu'elle nécessiterait techniquement, pour être assumée devant le jury comme une feuille de route claire plutôt que comme une simple liste de vœux.</w:t>
       </w:r>
     </w:p>
     <w:p>
@@ -1563,7 +1640,7 @@
         <w:spacing w:after="160"/>
       </w:pPr>
       <w:r>
-        <w:t xml:space="preserve">Nécessiterait un graphe routier complet et un moteur de routing multi-critères (temps, sécurité, météo). Hors de portée sur une semaine ; conservé comme évolution V2.</w:t>
+        <w:t>Propose le meilleur itinéraire entre une origine et une destination données (ex. "Foyer des Jeunes de Marcory" vers "Saint Jean, Cocody"), en tenant compte de plusieurs facteurs combinés par segment plutôt que de la seule distance : congestion prédite (module IA trafic existant), risque météo/inondation (module IA risques environnementaux existant), et temps de trajet estimé. Techniquement, nécessiterait de modéliser le réseau routier comme un graphe complet (nœuds = intersections, arêtes = segments) et un algorithme de plus court chemin pondéré (ex. Dijkstra ou A*) recalculant les poids des arêtes à partir des sorties des modules IA déjà en production. Contrairement à la version initiale de cette feuille de route, le prérequis principal (une géométrie routière suffisamment maillée) est désormais déjà couvert par le MVP : l'import OSM (section 7) porte sur l'ensemble du réseau principal d'Abidjan, toutes communes confondues, et non plus sur une liste restreinte d'axes. Reste à construire l'algorithme de routing lui-même — hors de portée en une semaine, mais directement réutilisable dès la fin du MVP, sans dépendre d'un nouvel import de données.</w:t>
       </w:r>
     </w:p>
     <w:p>
@@ -1580,7 +1657,23 @@
         <w:spacing w:after="160"/>
       </w:pPr>
       <w:r>
-        <w:t xml:space="preserve">L'apprentissage des habitudes utilisateurs nécessite un historique réel sur plusieurs semaines, incompatible avec un MVP reposant sur 10 utilisateurs fictifs et des données simulées.</w:t>
+        <w:t>L'apprentissage des habitudes utilisateurs nécessite un historique réel sur plusieurs semaines, incompatible avec un MVP reposant sur des utilisateurs fictifs (même portés à 100, avec des noms et trajets domicile-travail réalistes) et des données de trafic simulées.</w:t>
+      </w:r>
+    </w:p>
+    <w:p>
+      <w:pPr>
+        <w:pStyle w:val="Heading2"/>
+      </w:pPr>
+      <w:r>
+        <w:t>Digital Twin de la ville</w:t>
+      </w:r>
+    </w:p>
+    <w:p>
+      <w:pPr>
+        <w:spacing w:after="160"/>
+      </w:pPr>
+      <w:r>
+        <w:t xml:space="preserve">Conservé comme vision à long terme : la ville modélisée comme un graphe (nœuds = carrefours, arêtes = routes, attributs = vitesse / capacité / risque), permettant de simuler l'effet de la fermeture d'une route avant travaux. Cette fonctionnalité, techniquement ambitieuse, est hors de portée en une semaine (données géographiques complètes et moteur de simulation requis). Elle doit être présentée au jury comme une feuille de route V2, et non comme un livrable du MVP — l'honnêteté sur ce point renforce la crédibilité du projet plutôt que de l'affaiblir.</w:t>
       </w:r>
     </w:p>
     <w:p>
@@ -1590,25 +1683,261 @@
     </w:p>
     <w:p>
       <w:pPr>
-        <w:pStyle w:val="Heading1"/>
-        <w:spacing w:after="200" w:before="400"/>
-      </w:pPr>
-      <w:r>
-        <w:t xml:space="preserve">6. Digital Twin de la ville — hors MVP</w:t>
-      </w:r>
-    </w:p>
-    <w:p>
-      <w:pPr>
-        <w:spacing w:after="160"/>
-      </w:pPr>
-      <w:r>
-        <w:t xml:space="preserve">Conservé comme vision à long terme : la ville modélisée comme un graphe (nœuds = carrefours, arêtes = routes, attributs = vitesse / capacité / risque), permettant de simuler l'effet de la fermeture d'une route avant travaux. Cette fonctionnalité, techniquement ambitieuse, est hors de portée en une semaine (données géographiques complètes et moteur de simulation requis). Elle doit être présentée au jury comme une feuille de route V2, et non comme un livrable du MVP — l'honnêteté sur ce point renforce la crédibilité du projet plutôt que de l'affaiblir.</w:t>
-      </w:r>
-    </w:p>
-    <w:p>
-      <w:pPr>
-        <w:spacing w:after="200"/>
-      </w:pPr>
+        <w:pStyle w:val="Heading2"/>
+      </w:pPr>
+      <w:r>
+        <w:t>Détection automatique par caméras (vision par ordinateur) — hors MVP</w:t>
+      </w:r>
+    </w:p>
+    <w:p>
+      <w:r>
+        <w:t>Vision V2, au même titre que le Digital Twin : détecter automatiquement la congestion et les incidents (accidents, véhicules en panne) par analyse vidéo de caméras de circulation, en complément du signalement citoyen. Un Système de Transport Intelligent (STI) existe déjà à Abidjan depuis 2021, avec des caméras sur les principales artères, mais il est opéré par le ministère de l'Intérieur à des fins de vidéo-verbalisation et n'est pas accessible en tant que source de données ouverte — un accès nécessiterait un partenariat institutionnel, hors de portée d'une compétition d'une semaine et non traité comme acquis dans le MVP.</w:t>
+      </w:r>
+    </w:p>
+    <w:p>
+      <w:r>
+        <w:t>Si le temps le permet après les étapes du MVP, une preuve de concept isolée peut être présentée en démo : comptage de véhicules par détection d'objets (ex. YOLO ou soustraction de fond OpenCV) sur une vidéo pré-enregistrée d'un axe d'Abidjan, non branchée au reste de l'application ni au module de prédiction. Objectif : illustrer la faisabilité technique de cette évolution V2 sans dépendre d'un accès réel aux caméras du STI ni engager de question de vie privée ou de cadre légal liée à l'exploitation de flux de vidéosurveillance publique.</w:t>
+      </w:r>
+    </w:p>
+    <w:p>
+      <w:pPr>
+        <w:pStyle w:val="Heading2"/>
+      </w:pPr>
+      <w:r>
+        <w:t>Synthèse de la feuille de route V2</w:t>
+      </w:r>
+    </w:p>
+    <w:p>
+      <w:r>
+        <w:t>Un même tableau de référence, pour prioriser objectivement ces quatre évolutions plutôt que de les traiter comme équivalentes :</w:t>
+      </w:r>
+    </w:p>
+    <w:tbl>
+      <w:tblPr>
+        <w:tblW w:type="auto" w:w="0"/>
+        <w:tblLook w:firstColumn="1" w:firstRow="1" w:lastColumn="0" w:lastRow="0" w:noHBand="0" w:noVBand="1" w:val="04A0"/>
+      </w:tblPr>
+      <w:tblGrid>
+        <w:gridCol w:w="2256"/>
+        <w:gridCol w:w="2256"/>
+        <w:gridCol w:w="2256"/>
+        <w:gridCol w:w="2256"/>
+      </w:tblGrid>
+      <w:tr>
+        <w:tc>
+          <w:tcPr>
+            <w:tcW w:type="dxa" w:w="2256"/>
+          </w:tcPr>
+          <w:p>
+            <w:r>
+              <w:t>Évolution V2</w:t>
+            </w:r>
+          </w:p>
+        </w:tc>
+        <w:tc>
+          <w:tcPr>
+            <w:tcW w:type="dxa" w:w="2256"/>
+          </w:tcPr>
+          <w:p>
+            <w:r>
+              <w:t>Ce qu'elle apporte</w:t>
+            </w:r>
+          </w:p>
+        </w:tc>
+        <w:tc>
+          <w:tcPr>
+            <w:tcW w:type="dxa" w:w="2256"/>
+          </w:tcPr>
+          <w:p>
+            <w:r>
+              <w:t>Prérequis principal</w:t>
+            </w:r>
+          </w:p>
+        </w:tc>
+        <w:tc>
+          <w:tcPr>
+            <w:tcW w:type="dxa" w:w="2256"/>
+          </w:tcPr>
+          <w:p>
+            <w:r>
+              <w:t>Dépendance externe</w:t>
+            </w:r>
+          </w:p>
+        </w:tc>
+      </w:tr>
+      <w:tr>
+        <w:tc>
+          <w:tcPr>
+            <w:tcW w:type="dxa" w:w="2256"/>
+          </w:tcPr>
+          <w:p>
+            <w:r>
+              <w:t>Optimisation d'itinéraire</w:t>
+            </w:r>
+          </w:p>
+        </w:tc>
+        <w:tc>
+          <w:tcPr>
+            <w:tcW w:type="dxa" w:w="2256"/>
+          </w:tcPr>
+          <w:p>
+            <w:r>
+              <w:t>Meilleur trajet A→B selon congestion + météo</w:t>
+            </w:r>
+          </w:p>
+        </w:tc>
+        <w:tc>
+          <w:tcPr>
+            <w:tcW w:type="dxa" w:w="2256"/>
+          </w:tcPr>
+          <w:p>
+            <w:r>
+              <w:t>Moteur de routing (Dijkstra/A*) à construire — la géométrie complète est déjà importée par le MVP</w:t>
+            </w:r>
+          </w:p>
+        </w:tc>
+        <w:tc>
+          <w:tcPr>
+            <w:tcW w:type="dxa" w:w="2256"/>
+          </w:tcPr>
+          <w:p>
+            <w:r>
+              <w:t>Aucune — priorité la plus directement réalisable après le MVP</w:t>
+            </w:r>
+          </w:p>
+        </w:tc>
+      </w:tr>
+      <w:tr>
+        <w:tc>
+          <w:tcPr>
+            <w:tcW w:type="dxa" w:w="2256"/>
+          </w:tcPr>
+          <w:p>
+            <w:r>
+              <w:t>IA comportementale</w:t>
+            </w:r>
+          </w:p>
+        </w:tc>
+        <w:tc>
+          <w:tcPr>
+            <w:tcW w:type="dxa" w:w="2256"/>
+          </w:tcPr>
+          <w:p>
+            <w:r>
+              <w:t>Alertes personnalisées selon les habitudes de chaque utilisateur</w:t>
+            </w:r>
+          </w:p>
+        </w:tc>
+        <w:tc>
+          <w:tcPr>
+            <w:tcW w:type="dxa" w:w="2256"/>
+          </w:tcPr>
+          <w:p>
+            <w:r>
+              <w:t>Historique réel sur plusieurs semaines par utilisateur</w:t>
+            </w:r>
+          </w:p>
+        </w:tc>
+        <w:tc>
+          <w:tcPr>
+            <w:tcW w:type="dxa" w:w="2256"/>
+          </w:tcPr>
+          <w:p>
+            <w:r>
+              <w:t>Adoption réelle de l'app dans la durée</w:t>
+            </w:r>
+          </w:p>
+        </w:tc>
+      </w:tr>
+      <w:tr>
+        <w:tc>
+          <w:tcPr>
+            <w:tcW w:type="dxa" w:w="2256"/>
+          </w:tcPr>
+          <w:p>
+            <w:r>
+              <w:t>Digital Twin</w:t>
+            </w:r>
+          </w:p>
+        </w:tc>
+        <w:tc>
+          <w:tcPr>
+            <w:tcW w:type="dxa" w:w="2256"/>
+          </w:tcPr>
+          <w:p>
+            <w:r>
+              <w:t>Simulation de l'effet d'une fermeture de route avant travaux</w:t>
+            </w:r>
+          </w:p>
+        </w:tc>
+        <w:tc>
+          <w:tcPr>
+            <w:tcW w:type="dxa" w:w="2256"/>
+          </w:tcPr>
+          <w:p>
+            <w:r>
+              <w:t>Graphe géographique complet + moteur de simulation</w:t>
+            </w:r>
+          </w:p>
+        </w:tc>
+        <w:tc>
+          <w:tcPr>
+            <w:tcW w:type="dxa" w:w="2256"/>
+          </w:tcPr>
+          <w:p>
+            <w:r>
+              <w:t>Aucune — mais gros effort de données</w:t>
+            </w:r>
+          </w:p>
+        </w:tc>
+      </w:tr>
+      <w:tr>
+        <w:tc>
+          <w:tcPr>
+            <w:tcW w:type="dxa" w:w="2256"/>
+          </w:tcPr>
+          <w:p>
+            <w:r>
+              <w:t>Détection par caméras</w:t>
+            </w:r>
+          </w:p>
+        </w:tc>
+        <w:tc>
+          <w:tcPr>
+            <w:tcW w:type="dxa" w:w="2256"/>
+          </w:tcPr>
+          <w:p>
+            <w:r>
+              <w:t>Détection automatique de congestion/incidents, sans dépendre du signalement citoyen</w:t>
+            </w:r>
+          </w:p>
+        </w:tc>
+        <w:tc>
+          <w:tcPr>
+            <w:tcW w:type="dxa" w:w="2256"/>
+          </w:tcPr>
+          <w:p>
+            <w:r>
+              <w:t>Modèle de vision par ordinateur (déjà testé en POC bonus)</w:t>
+            </w:r>
+          </w:p>
+        </w:tc>
+        <w:tc>
+          <w:tcPr>
+            <w:tcW w:type="dxa" w:w="2256"/>
+          </w:tcPr>
+          <w:p>
+            <w:r>
+              <w:t>Accès au STI ou à un réseau de caméras dédié</w:t>
+            </w:r>
+          </w:p>
+        </w:tc>
+      </w:tr>
+    </w:tbl>
+    <w:p>
+      <w:r>
+        <w:t>Lecture recommandée : l'optimisation d'itinéraire est la priorité naturelle après le MVP, car elle ne dépend d'aucun partenariat externe et la géométrie routière nécessaire est déjà entièrement disponible (import OSM couvrant tout le réseau principal d'Abidjan) — il ne reste qu'un travail d'ingénierie sur l'algorithme de routing lui-même. La détection par caméras reste la plus incertaine, car elle dépend d'un accès institutionnel hors du contrôle de l'équipe.</w:t>
+      </w:r>
     </w:p>
     <w:p>
       <w:pPr>
@@ -2008,6 +2337,53 @@
     <w:p>
       <w:pPr>
         <w:pStyle w:val="Heading2"/>
+      </w:pPr>
+      <w:r>
+        <w:t>Sources de données</w:t>
+      </w:r>
+    </w:p>
+    <w:p>
+      <w:r>
+        <w:t>Le MVP combine des données réelles et des données simulées, en documentant explicitement lesquelles sont lesquelles pour rester honnête devant le jury :</w:t>
+      </w:r>
+    </w:p>
+    <w:p>
+      <w:pPr>
+        <w:pStyle w:val="ListParagraph"/>
+      </w:pPr>
+      <w:r>
+        <w:t>Géométrie des segments (RoadSegment) : réelle, importée depuis OpenStreetMap (requête Overpass filtrée sur les routes principales et secondaires — motorway/trunk/primary/secondary/tertiary) sur l'ensemble des communes du Grand Abidjan, pas seulement une liste restreinte d'axes emblématiques. Coordonnées GPS et noms réels de l'ensemble du réseau structurant couvert.</w:t>
+      </w:r>
+    </w:p>
+    <w:p>
+      <w:pPr>
+        <w:pStyle w:val="ListParagraph"/>
+      </w:pPr>
+      <w:r>
+        <w:t>Historique météo (WeatherEvent) : réel, importé depuis une API météo historique publique pour la période couverte par la démonstration.</w:t>
+      </w:r>
+    </w:p>
+    <w:p>
+      <w:pPr>
+        <w:pStyle w:val="ListParagraph"/>
+      </w:pPr>
+      <w:r>
+        <w:t>Historique de trafic (TrafficRecord) et signalements (Report) : simulés, faute d'API de congestion ouverte pour Abidjan à ce stade — mais calibrés sur des patterns horaires réels documentés (heures de pointe locales) et générés avec un seed fixe pour être reproductibles à l'identique en démo.</w:t>
+      </w:r>
+    </w:p>
+    <w:p>
+      <w:r>
+        <w:t>Les imports de données réelles se font hors ligne (fichiers locaux), sans appel réseau au moment de la démonstration, pour garder le système fiable le jour J.</w:t>
+      </w:r>
+    </w:p>
+    <w:p>
+      <w:r>
+        <w:t>Paramètres explicites retenus pour éviter des bugs silencieux : TIME_ZONE = "Africa/Abidjan" (la logique de prédiction dépend de l'heure locale) et un logging applicatif de base (console, niveau INFO) pour diagnostiquer rapidement un incident pendant la démonstration.</w:t>
+      </w:r>
+    </w:p>
+    <w:p>
+      <w:pPr>
+        <w:pStyle w:val="Heading2"/>
         <w:spacing w:after="120" w:before="280"/>
       </w:pPr>
       <w:r>
@@ -2019,7 +2395,7 @@
         <w:spacing w:after="160"/>
       </w:pPr>
       <w:r>
-        <w:t xml:space="preserve">App citoyens (Flutter) et Dashboard autorités (Flutter Web / Django Admin) → Backend Django REST API (Auth, Endpoints, Module IA prédictif T+15min) → PostgreSQL (segments, historique, signalements, prédictions), alimenté en amont par les données simulées (historique trafic, météo, 10 utilisateurs fictifs).</w:t>
+        <w:t>App citoyens (Flutter) et Dashboard autorités (Flutter Web / Django Admin) → Backend Django REST API (Auth, Endpoints, Module IA prédictif T+15min) → PostgreSQL (segments, historique, signalements, prédictions), alimenté en amont par des commandes d'import et de seed dédiées : géométrie réelle des segments (OpenStreetMap/HDX), historique météo réel (API météo historique), historique de trafic simulé calibré, jusqu'à 100 utilisateurs fictifs générés de façon réaliste, et un petit nombre de signalements de seed pour que le dashboard autorités ne soit pas vide à l'ouverture de la démo.</w:t>
       </w:r>
     </w:p>
     <w:p>
@@ -2250,7 +2626,7 @@
                 <w:sz w:val="19"/>
                 <w:szCs w:val="19"/>
               </w:rPr>
-              <w:t xml:space="preserve">id, nom, coordonnées GPS, zone_inondable</w:t>
+              <w:t>id, nom, coordonnées GPS (source réelle OSM/HDX), zone, zone_inondable, source_geometrie</w:t>
             </w:r>
           </w:p>
         </w:tc>
@@ -2318,7 +2694,7 @@
                 <w:sz w:val="19"/>
                 <w:szCs w:val="19"/>
               </w:rPr>
-              <w:t xml:space="preserve">segment_id, timestamp, niveau_congestion, source</w:t>
+              <w:t>segment_id, timestamp, niveau_congestion, source (simulé calibré/signalement)</w:t>
             </w:r>
           </w:p>
         </w:tc>
@@ -2386,7 +2762,7 @@
                 <w:sz w:val="19"/>
                 <w:szCs w:val="19"/>
               </w:rPr>
-              <w:t xml:space="preserve">zone, type, intensité, timestamp</w:t>
+              <w:t>zone, type, intensité, timestamp, source (historique_reel/manuel)</w:t>
             </w:r>
           </w:p>
         </w:tc>
@@ -2454,7 +2830,7 @@
                 <w:sz w:val="19"/>
                 <w:szCs w:val="19"/>
               </w:rPr>
-              <w:t xml:space="preserve">user_id, segment_id, type, gravité, statut</w:t>
+              <w:t>user_id, segment_id, type, gravité, statut, source (seed/live)</w:t>
             </w:r>
           </w:p>
         </w:tc>
@@ -2522,7 +2898,7 @@
                 <w:sz w:val="19"/>
                 <w:szCs w:val="19"/>
               </w:rPr>
-              <w:t xml:space="preserve">segment_id, horizon_min=15, score_prédit, facteurs (JSON)</w:t>
+              <w:t>segment_id, horizon_min=15, score_prédit, facteurs (JSON), version_modele</w:t>
             </w:r>
           </w:p>
         </w:tc>
@@ -2614,6 +2990,62 @@
       </w:pPr>
       <w:r>
         <w:t xml:space="preserve">Anonymisation basique des identifiants dans les données simulées — bonne pratique conservée même en démonstration</w:t>
+      </w:r>
+    </w:p>
+    <w:p>
+      <w:pPr>
+        <w:pStyle w:val="ListParagraph"/>
+      </w:pPr>
+      <w:r>
+        <w:t>Traçabilité des sources : origine documentée dans le code pour chaque donnée réelle importée (licence ODbL pour OpenStreetMap, source et période pour l'historique météo).</w:t>
+      </w:r>
+    </w:p>
+    <w:p>
+      <w:pPr>
+        <w:pStyle w:val="ListParagraph"/>
+      </w:pPr>
+      <w:r>
+        <w:t>Limitation de débit (throttling) sur les signalements citoyens (ex. 5 requêtes / 10 minutes par utilisateur), pour empêcher un usage abusif ou un bug client de polluer le score composite du dashboard autorités.</w:t>
+      </w:r>
+    </w:p>
+    <w:p>
+      <w:pPr>
+        <w:pStyle w:val="ListParagraph"/>
+      </w:pPr>
+      <w:r>
+        <w:t>Sécurité du modèle de prédiction : validation des entrées de predict_congestion (segment existant, horizon raisonnable) pour éviter les erreurs exploitables ; limitation de débit sur la lecture des prédictions pour limiter le scraping d'un actif potentiellement monétisable ; les facteurs explicatifs restent lisibles pour l'utilisateur, mais les poids exacts du modèle (weights.py) ne sont jamais exposés bruts dans les réponses API, pour ne pas faciliter la reproduction du modèle par un tiers.</w:t>
+      </w:r>
+    </w:p>
+    <w:p>
+      <w:pPr>
+        <w:pStyle w:val="ListParagraph"/>
+      </w:pPr>
+      <w:r>
+        <w:t>Validation renforcée du mot de passe à l'inscription citoyenne (longueur minimale explicite).</w:t>
+      </w:r>
+    </w:p>
+    <w:p>
+      <w:pPr>
+        <w:pStyle w:val="ListParagraph"/>
+      </w:pPr>
+      <w:r>
+        <w:t>CORS restreint aux origines réelles de l'app Flutter Web et du dashboard, plutôt qu'une autorisation ouverte à toutes les origines (acceptable seulement en développement local).</w:t>
+      </w:r>
+    </w:p>
+    <w:p>
+      <w:pPr>
+        <w:pStyle w:val="ListParagraph"/>
+      </w:pPr>
+      <w:r>
+        <w:t>Durcissement Django en production (via variables d'environnement, sans casser le développement local) : DEBUG=False, ALLOWED_HOSTS restreint, cookies de session et CSRF marqués sécurisés, redirection HTTPS forcée.</w:t>
+      </w:r>
+    </w:p>
+    <w:p>
+      <w:pPr>
+        <w:pStyle w:val="ListParagraph"/>
+      </w:pPr>
+      <w:r>
+        <w:t>Limitation de débit (throttling) dédiée sur l'authentification (POST /api/auth/login/), distincte de celle des signalements, pour limiter le risque de force brute sur les mots de passe.</w:t>
       </w:r>
     </w:p>
     <w:p>
@@ -3197,6 +3629,19 @@
     </w:p>
     <w:p>
       <w:pPr>
+        <w:pStyle w:val="Heading2"/>
+      </w:pPr>
+      <w:r>
+        <w:t>Vérification de préparation à la démo</w:t>
+      </w:r>
+    </w:p>
+    <w:p>
+      <w:r>
+        <w:t>La veille de la démonstration, une commande dédiée (check_demo_readiness) vérifie sans rien modifier : la présence de segments à géométrie réelle, la présence d'un historique météo réel, l'existence d'une prédiction récente (moins de 15 minutes) pour chaque segment, et la présence d'au moins un signalement de seed pour que le dashboard autorités ne soit pas vide à l'ouverture. Objectif : détecter un import manquant ou un job périodique en échec avant qu'il ne soit trop tard, plutôt que de le découvrir devant le jury.</w:t>
+      </w:r>
+    </w:p>
+    <w:p>
+      <w:pPr>
         <w:pStyle w:val="Heading1"/>
         <w:spacing w:after="200" w:before="400"/>
       </w:pPr>
@@ -4162,7 +4607,7 @@
                 <w:sz w:val="19"/>
                 <w:szCs w:val="19"/>
               </w:rPr>
-              <w:t xml:space="preserve">MVP reposant sur données simulées à ce stade</w:t>
+              <w:t>Géométrie et météo réelles ; trafic et signalements simulés faute d'API de congestion ouverte pour Abidjan</w:t>
             </w:r>
           </w:p>
         </w:tc>
@@ -4308,7 +4753,7 @@
         <w:spacing w:after="160"/>
       </w:pPr>
       <w:r>
-        <w:t xml:space="preserve">Regard critique assumé : les données sont simulées, le modèle de prédiction est volontairement simple, et plusieurs fonctionnalités ambitieuses (digital twin, IA comportementale, optimisation d'itinéraire complète) sont explicitement placées en feuille de route plutôt que présentées comme acquises. Ce choix de sincérité sur le périmètre est un argument de crédibilité face au jury, pas une faiblesse à dissimuler.</w:t>
+        <w:t>Regard critique assumé : la géométrie des segments et l'historique météo s'appuient désormais sur des données réelles (OpenStreetMap/HDX, API météo historique), ce qui réduit la part de simulation par rapport à la version initiale du cadrage. L'historique de trafic et les signalements restent simulés, faute d'API de congestion ouverte pour Abidjan, mais de façon calibrée et reproductible plutôt qu'aléatoire. Le modèle de prédiction reste volontairement simple, et plusieurs fonctionnalités ambitieuses (digital twin, IA comportementale, optimisation d'itinéraire complète) sont explicitement placées en feuille de route plutôt que présentées comme acquises. Ce choix de sincérité sur le périmètre et sur la provenance des données est un argument de crédibilité face au jury, pas une faiblesse à dissimuler.</w:t>
       </w:r>
     </w:p>
     <w:sectPr>

</xml_diff>